<commit_message>
Update AI Agent Evals Team Guide
</commit_message>
<xml_diff>
--- a/eval/AI_Agent_Evals_Team_Guide.docx
+++ b/eval/AI_Agent_Evals_Team_Guide.docx
@@ -5076,6 +5076,1601 @@
         <w:t xml:space="preserve">Step - Run safety checks every time and reliability checks on a scheduled cadence.</w:t>
       </w:r>
     </w:p>
+    <w:p>
+      <w:pPr>
+        <w:pStyle w:val="Heading1"/>
+        <w:spacing w:after="120" w:before="80" w:line="300"/>
+      </w:pPr>
+      <w:r>
+        <w:rPr>
+          <w:rFonts w:ascii="Arial" w:cs="Arial" w:eastAsia="Arial" w:hAnsi="Arial"/>
+          <w:color w:val="111827"/>
+          <w:sz w:val="22"/>
+          <w:szCs w:val="22"/>
+        </w:rPr>
+        <w:t xml:space="preserve">14. Infrastructure and tools for eval execution</w:t>
+      </w:r>
+    </w:p>
+    <w:p>
+      <w:pPr>
+        <w:spacing w:after="120" w:before="80" w:line="300"/>
+      </w:pPr>
+      <w:r>
+        <w:rPr>
+          <w:rFonts w:ascii="Arial" w:cs="Arial" w:eastAsia="Arial" w:hAnsi="Arial"/>
+          <w:color w:val="111827"/>
+          <w:sz w:val="22"/>
+          <w:szCs w:val="22"/>
+        </w:rPr>
+        <w:t xml:space="preserve">A practical eval platform does not need to start large. It should start with the minimum set of infrastructure that makes evals repeatable, inspectable, and comparable over time. The recommended architecture is layered: runner, controlled environment, agent runtime, transcript store, graders, scorecards, observability, and CI/CD.</w:t>
+      </w:r>
+    </w:p>
+    <w:tbl>
+      <w:tblPr>
+        <w:tblW w:type="dxa" w:w="10080"/>
+        <w:tblBorders>
+          <w:top w:val="single" w:color="auto" w:sz="4"/>
+          <w:left w:val="single" w:color="auto" w:sz="4"/>
+          <w:bottom w:val="single" w:color="auto" w:sz="4"/>
+          <w:right w:val="single" w:color="auto" w:sz="4"/>
+          <w:insideH w:val="single" w:color="auto" w:sz="4"/>
+          <w:insideV w:val="single" w:color="auto" w:sz="4"/>
+        </w:tblBorders>
+      </w:tblPr>
+      <w:tblGrid>
+        <w:gridCol w:w="1900"/>
+        <w:gridCol w:w="4200"/>
+        <w:gridCol w:w="3980"/>
+      </w:tblGrid>
+      <w:tr>
+        <w:trPr>
+          <w:tblHeader/>
+        </w:trPr>
+        <w:tc>
+          <w:tcPr>
+            <w:tcW w:type="dxa" w:w="1900"/>
+            <w:tcBorders>
+              <w:top w:val="single" w:color="D1D5DB" w:sz="1"/>
+              <w:left w:val="single" w:color="D1D5DB" w:sz="1"/>
+              <w:bottom w:val="single" w:color="D1D5DB" w:sz="1"/>
+              <w:right w:val="single" w:color="D1D5DB" w:sz="1"/>
+            </w:tcBorders>
+            <w:shd w:fill="1F4E79" w:val="clear"/>
+            <w:tcMar>
+              <w:top w:type="dxa" w:w="120"/>
+              <w:left w:type="dxa" w:w="120"/>
+              <w:bottom w:type="dxa" w:w="120"/>
+              <w:right w:type="dxa" w:w="120"/>
+            </w:tcMar>
+          </w:tcPr>
+          <w:p>
+            <w:pPr>
+              <w:spacing w:after="0" w:before="0" w:line="300"/>
+            </w:pPr>
+            <w:r>
+              <w:rPr>
+                <w:rFonts w:ascii="Arial" w:cs="Arial" w:eastAsia="Arial" w:hAnsi="Arial"/>
+                <w:b/>
+                <w:bCs/>
+                <w:color w:val="FFFFFF"/>
+                <w:sz w:val="22"/>
+                <w:szCs w:val="22"/>
+              </w:rPr>
+              <w:t xml:space="preserve">Layer</w:t>
+            </w:r>
+          </w:p>
+        </w:tc>
+        <w:tc>
+          <w:tcPr>
+            <w:tcW w:type="dxa" w:w="4200"/>
+            <w:tcBorders>
+              <w:top w:val="single" w:color="D1D5DB" w:sz="1"/>
+              <w:left w:val="single" w:color="D1D5DB" w:sz="1"/>
+              <w:bottom w:val="single" w:color="D1D5DB" w:sz="1"/>
+              <w:right w:val="single" w:color="D1D5DB" w:sz="1"/>
+            </w:tcBorders>
+            <w:shd w:fill="1F4E79" w:val="clear"/>
+            <w:tcMar>
+              <w:top w:type="dxa" w:w="120"/>
+              <w:left w:type="dxa" w:w="120"/>
+              <w:bottom w:type="dxa" w:w="120"/>
+              <w:right w:type="dxa" w:w="120"/>
+            </w:tcMar>
+          </w:tcPr>
+          <w:p>
+            <w:pPr>
+              <w:spacing w:after="0" w:before="0" w:line="300"/>
+            </w:pPr>
+            <w:r>
+              <w:rPr>
+                <w:rFonts w:ascii="Arial" w:cs="Arial" w:eastAsia="Arial" w:hAnsi="Arial"/>
+                <w:b/>
+                <w:bCs/>
+                <w:color w:val="FFFFFF"/>
+                <w:sz w:val="22"/>
+                <w:szCs w:val="22"/>
+              </w:rPr>
+              <w:t xml:space="preserve">Recommended infrastructure and tools</w:t>
+            </w:r>
+          </w:p>
+        </w:tc>
+        <w:tc>
+          <w:tcPr>
+            <w:tcW w:type="dxa" w:w="3980"/>
+            <w:tcBorders>
+              <w:top w:val="single" w:color="D1D5DB" w:sz="1"/>
+              <w:left w:val="single" w:color="D1D5DB" w:sz="1"/>
+              <w:bottom w:val="single" w:color="D1D5DB" w:sz="1"/>
+              <w:right w:val="single" w:color="D1D5DB" w:sz="1"/>
+            </w:tcBorders>
+            <w:shd w:fill="1F4E79" w:val="clear"/>
+            <w:tcMar>
+              <w:top w:type="dxa" w:w="120"/>
+              <w:left w:type="dxa" w:w="120"/>
+              <w:bottom w:type="dxa" w:w="120"/>
+              <w:right w:type="dxa" w:w="120"/>
+            </w:tcMar>
+          </w:tcPr>
+          <w:p>
+            <w:pPr>
+              <w:spacing w:after="0" w:before="0" w:line="300"/>
+            </w:pPr>
+            <w:r>
+              <w:rPr>
+                <w:rFonts w:ascii="Arial" w:cs="Arial" w:eastAsia="Arial" w:hAnsi="Arial"/>
+                <w:b/>
+                <w:bCs/>
+                <w:color w:val="FFFFFF"/>
+                <w:sz w:val="22"/>
+                <w:szCs w:val="22"/>
+              </w:rPr>
+              <w:t xml:space="preserve">Purpose</w:t>
+            </w:r>
+          </w:p>
+        </w:tc>
+      </w:tr>
+      <w:tr>
+        <w:tc>
+          <w:tcPr>
+            <w:tcW w:type="dxa" w:w="1900"/>
+            <w:tcBorders>
+              <w:top w:val="single" w:color="D1D5DB" w:sz="1"/>
+              <w:left w:val="single" w:color="D1D5DB" w:sz="1"/>
+              <w:bottom w:val="single" w:color="D1D5DB" w:sz="1"/>
+              <w:right w:val="single" w:color="D1D5DB" w:sz="1"/>
+            </w:tcBorders>
+            <w:tcMar>
+              <w:top w:type="dxa" w:w="120"/>
+              <w:left w:type="dxa" w:w="120"/>
+              <w:bottom w:type="dxa" w:w="120"/>
+              <w:right w:type="dxa" w:w="120"/>
+            </w:tcMar>
+          </w:tcPr>
+          <w:p>
+            <w:pPr>
+              <w:spacing w:after="0" w:before="0" w:line="300"/>
+            </w:pPr>
+            <w:r>
+              <w:rPr>
+                <w:rFonts w:ascii="Arial" w:cs="Arial" w:eastAsia="Arial" w:hAnsi="Arial"/>
+                <w:color w:val="111827"/>
+                <w:sz w:val="22"/>
+                <w:szCs w:val="22"/>
+              </w:rPr>
+              <w:t xml:space="preserve">Eval runner</w:t>
+            </w:r>
+          </w:p>
+        </w:tc>
+        <w:tc>
+          <w:tcPr>
+            <w:tcW w:type="dxa" w:w="4200"/>
+            <w:tcBorders>
+              <w:top w:val="single" w:color="D1D5DB" w:sz="1"/>
+              <w:left w:val="single" w:color="D1D5DB" w:sz="1"/>
+              <w:bottom w:val="single" w:color="D1D5DB" w:sz="1"/>
+              <w:right w:val="single" w:color="D1D5DB" w:sz="1"/>
+            </w:tcBorders>
+            <w:tcMar>
+              <w:top w:type="dxa" w:w="120"/>
+              <w:left w:type="dxa" w:w="120"/>
+              <w:bottom w:type="dxa" w:w="120"/>
+              <w:right w:type="dxa" w:w="120"/>
+            </w:tcMar>
+          </w:tcPr>
+          <w:p>
+            <w:pPr>
+              <w:spacing w:after="0" w:before="0" w:line="300"/>
+            </w:pPr>
+            <w:r>
+              <w:rPr>
+                <w:rFonts w:ascii="Arial" w:cs="Arial" w:eastAsia="Arial" w:hAnsi="Arial"/>
+                <w:color w:val="111827"/>
+                <w:sz w:val="22"/>
+                <w:szCs w:val="22"/>
+              </w:rPr>
+              <w:t xml:space="preserve">Python or TypeScript runner; Azure Container Apps; GitHub Actions; Azure DevOps Pipelines</w:t>
+            </w:r>
+          </w:p>
+        </w:tc>
+        <w:tc>
+          <w:tcPr>
+            <w:tcW w:type="dxa" w:w="3980"/>
+            <w:tcBorders>
+              <w:top w:val="single" w:color="D1D5DB" w:sz="1"/>
+              <w:left w:val="single" w:color="D1D5DB" w:sz="1"/>
+              <w:bottom w:val="single" w:color="D1D5DB" w:sz="1"/>
+              <w:right w:val="single" w:color="D1D5DB" w:sz="1"/>
+            </w:tcBorders>
+            <w:tcMar>
+              <w:top w:type="dxa" w:w="120"/>
+              <w:left w:type="dxa" w:w="120"/>
+              <w:bottom w:type="dxa" w:w="120"/>
+              <w:right w:type="dxa" w:w="120"/>
+            </w:tcMar>
+          </w:tcPr>
+          <w:p>
+            <w:pPr>
+              <w:spacing w:after="0" w:before="0" w:line="300"/>
+            </w:pPr>
+            <w:r>
+              <w:rPr>
+                <w:rFonts w:ascii="Arial" w:cs="Arial" w:eastAsia="Arial" w:hAnsi="Arial"/>
+                <w:color w:val="111827"/>
+                <w:sz w:val="22"/>
+                <w:szCs w:val="22"/>
+              </w:rPr>
+              <w:t xml:space="preserve">Executes tasks, resets fixtures, invokes the agent, records transcripts, and starts grading.</w:t>
+            </w:r>
+          </w:p>
+        </w:tc>
+      </w:tr>
+      <w:tr>
+        <w:tc>
+          <w:tcPr>
+            <w:tcW w:type="dxa" w:w="1900"/>
+            <w:tcBorders>
+              <w:top w:val="single" w:color="D1D5DB" w:sz="1"/>
+              <w:left w:val="single" w:color="D1D5DB" w:sz="1"/>
+              <w:bottom w:val="single" w:color="D1D5DB" w:sz="1"/>
+              <w:right w:val="single" w:color="D1D5DB" w:sz="1"/>
+            </w:tcBorders>
+            <w:tcMar>
+              <w:top w:type="dxa" w:w="120"/>
+              <w:left w:type="dxa" w:w="120"/>
+              <w:bottom w:type="dxa" w:w="120"/>
+              <w:right w:type="dxa" w:w="120"/>
+            </w:tcMar>
+          </w:tcPr>
+          <w:p>
+            <w:pPr>
+              <w:spacing w:after="0" w:before="0" w:line="300"/>
+            </w:pPr>
+            <w:r>
+              <w:rPr>
+                <w:rFonts w:ascii="Arial" w:cs="Arial" w:eastAsia="Arial" w:hAnsi="Arial"/>
+                <w:color w:val="111827"/>
+                <w:sz w:val="22"/>
+                <w:szCs w:val="22"/>
+              </w:rPr>
+              <w:t xml:space="preserve">Controlled environment</w:t>
+            </w:r>
+          </w:p>
+        </w:tc>
+        <w:tc>
+          <w:tcPr>
+            <w:tcW w:type="dxa" w:w="4200"/>
+            <w:tcBorders>
+              <w:top w:val="single" w:color="D1D5DB" w:sz="1"/>
+              <w:left w:val="single" w:color="D1D5DB" w:sz="1"/>
+              <w:bottom w:val="single" w:color="D1D5DB" w:sz="1"/>
+              <w:right w:val="single" w:color="D1D5DB" w:sz="1"/>
+            </w:tcBorders>
+            <w:tcMar>
+              <w:top w:type="dxa" w:w="120"/>
+              <w:left w:type="dxa" w:w="120"/>
+              <w:bottom w:type="dxa" w:w="120"/>
+              <w:right w:type="dxa" w:w="120"/>
+            </w:tcMar>
+          </w:tcPr>
+          <w:p>
+            <w:pPr>
+              <w:spacing w:after="0" w:before="0" w:line="300"/>
+            </w:pPr>
+            <w:r>
+              <w:rPr>
+                <w:rFonts w:ascii="Arial" w:cs="Arial" w:eastAsia="Arial" w:hAnsi="Arial"/>
+                <w:color w:val="111827"/>
+                <w:sz w:val="22"/>
+                <w:szCs w:val="22"/>
+              </w:rPr>
+              <w:t xml:space="preserve">Dev or staging tenant; synthetic test data; seeded databases; mock services; test mailboxes and calendars</w:t>
+            </w:r>
+          </w:p>
+        </w:tc>
+        <w:tc>
+          <w:tcPr>
+            <w:tcW w:type="dxa" w:w="3980"/>
+            <w:tcBorders>
+              <w:top w:val="single" w:color="D1D5DB" w:sz="1"/>
+              <w:left w:val="single" w:color="D1D5DB" w:sz="1"/>
+              <w:bottom w:val="single" w:color="D1D5DB" w:sz="1"/>
+              <w:right w:val="single" w:color="D1D5DB" w:sz="1"/>
+            </w:tcBorders>
+            <w:tcMar>
+              <w:top w:type="dxa" w:w="120"/>
+              <w:left w:type="dxa" w:w="120"/>
+              <w:bottom w:type="dxa" w:w="120"/>
+              <w:right w:type="dxa" w:w="120"/>
+            </w:tcMar>
+          </w:tcPr>
+          <w:p>
+            <w:pPr>
+              <w:spacing w:after="0" w:before="0" w:line="300"/>
+            </w:pPr>
+            <w:r>
+              <w:rPr>
+                <w:rFonts w:ascii="Arial" w:cs="Arial" w:eastAsia="Arial" w:hAnsi="Arial"/>
+                <w:color w:val="111827"/>
+                <w:sz w:val="22"/>
+                <w:szCs w:val="22"/>
+              </w:rPr>
+              <w:t xml:space="preserve">Keeps evals repeatable and prevents production impact.</w:t>
+            </w:r>
+          </w:p>
+        </w:tc>
+      </w:tr>
+      <w:tr>
+        <w:tc>
+          <w:tcPr>
+            <w:tcW w:type="dxa" w:w="1900"/>
+            <w:tcBorders>
+              <w:top w:val="single" w:color="D1D5DB" w:sz="1"/>
+              <w:left w:val="single" w:color="D1D5DB" w:sz="1"/>
+              <w:bottom w:val="single" w:color="D1D5DB" w:sz="1"/>
+              <w:right w:val="single" w:color="D1D5DB" w:sz="1"/>
+            </w:tcBorders>
+            <w:tcMar>
+              <w:top w:type="dxa" w:w="120"/>
+              <w:left w:type="dxa" w:w="120"/>
+              <w:bottom w:type="dxa" w:w="120"/>
+              <w:right w:type="dxa" w:w="120"/>
+            </w:tcMar>
+          </w:tcPr>
+          <w:p>
+            <w:pPr>
+              <w:spacing w:after="0" w:before="0" w:line="300"/>
+            </w:pPr>
+            <w:r>
+              <w:rPr>
+                <w:rFonts w:ascii="Arial" w:cs="Arial" w:eastAsia="Arial" w:hAnsi="Arial"/>
+                <w:color w:val="111827"/>
+                <w:sz w:val="22"/>
+                <w:szCs w:val="22"/>
+              </w:rPr>
+              <w:t xml:space="preserve">Agent runtime</w:t>
+            </w:r>
+          </w:p>
+        </w:tc>
+        <w:tc>
+          <w:tcPr>
+            <w:tcW w:type="dxa" w:w="4200"/>
+            <w:tcBorders>
+              <w:top w:val="single" w:color="D1D5DB" w:sz="1"/>
+              <w:left w:val="single" w:color="D1D5DB" w:sz="1"/>
+              <w:bottom w:val="single" w:color="D1D5DB" w:sz="1"/>
+              <w:right w:val="single" w:color="D1D5DB" w:sz="1"/>
+            </w:tcBorders>
+            <w:tcMar>
+              <w:top w:type="dxa" w:w="120"/>
+              <w:left w:type="dxa" w:w="120"/>
+              <w:bottom w:type="dxa" w:w="120"/>
+              <w:right w:type="dxa" w:w="120"/>
+            </w:tcMar>
+          </w:tcPr>
+          <w:p>
+            <w:pPr>
+              <w:spacing w:after="0" w:before="0" w:line="300"/>
+            </w:pPr>
+            <w:r>
+              <w:rPr>
+                <w:rFonts w:ascii="Arial" w:cs="Arial" w:eastAsia="Arial" w:hAnsi="Arial"/>
+                <w:color w:val="111827"/>
+                <w:sz w:val="22"/>
+                <w:szCs w:val="22"/>
+              </w:rPr>
+              <w:t xml:space="preserve">Azure AI Foundry Agent Service; custom agent harness; Semantic Kernel; LangGraph; AutoGen</w:t>
+            </w:r>
+          </w:p>
+        </w:tc>
+        <w:tc>
+          <w:tcPr>
+            <w:tcW w:type="dxa" w:w="3980"/>
+            <w:tcBorders>
+              <w:top w:val="single" w:color="D1D5DB" w:sz="1"/>
+              <w:left w:val="single" w:color="D1D5DB" w:sz="1"/>
+              <w:bottom w:val="single" w:color="D1D5DB" w:sz="1"/>
+              <w:right w:val="single" w:color="D1D5DB" w:sz="1"/>
+            </w:tcBorders>
+            <w:tcMar>
+              <w:top w:type="dxa" w:w="120"/>
+              <w:left w:type="dxa" w:w="120"/>
+              <w:bottom w:type="dxa" w:w="120"/>
+              <w:right w:type="dxa" w:w="120"/>
+            </w:tcMar>
+          </w:tcPr>
+          <w:p>
+            <w:pPr>
+              <w:spacing w:after="0" w:before="0" w:line="300"/>
+            </w:pPr>
+            <w:r>
+              <w:rPr>
+                <w:rFonts w:ascii="Arial" w:cs="Arial" w:eastAsia="Arial" w:hAnsi="Arial"/>
+                <w:color w:val="111827"/>
+                <w:sz w:val="22"/>
+                <w:szCs w:val="22"/>
+              </w:rPr>
+              <w:t xml:space="preserve">Runs the agent under test with a fixed, stamped configuration.</w:t>
+            </w:r>
+          </w:p>
+        </w:tc>
+      </w:tr>
+      <w:tr>
+        <w:tc>
+          <w:tcPr>
+            <w:tcW w:type="dxa" w:w="1900"/>
+            <w:tcBorders>
+              <w:top w:val="single" w:color="D1D5DB" w:sz="1"/>
+              <w:left w:val="single" w:color="D1D5DB" w:sz="1"/>
+              <w:bottom w:val="single" w:color="D1D5DB" w:sz="1"/>
+              <w:right w:val="single" w:color="D1D5DB" w:sz="1"/>
+            </w:tcBorders>
+            <w:tcMar>
+              <w:top w:type="dxa" w:w="120"/>
+              <w:left w:type="dxa" w:w="120"/>
+              <w:bottom w:type="dxa" w:w="120"/>
+              <w:right w:type="dxa" w:w="120"/>
+            </w:tcMar>
+          </w:tcPr>
+          <w:p>
+            <w:pPr>
+              <w:spacing w:after="0" w:before="0" w:line="300"/>
+            </w:pPr>
+            <w:r>
+              <w:rPr>
+                <w:rFonts w:ascii="Arial" w:cs="Arial" w:eastAsia="Arial" w:hAnsi="Arial"/>
+                <w:color w:val="111827"/>
+                <w:sz w:val="22"/>
+                <w:szCs w:val="22"/>
+              </w:rPr>
+              <w:t xml:space="preserve">Transcript store</w:t>
+            </w:r>
+          </w:p>
+        </w:tc>
+        <w:tc>
+          <w:tcPr>
+            <w:tcW w:type="dxa" w:w="4200"/>
+            <w:tcBorders>
+              <w:top w:val="single" w:color="D1D5DB" w:sz="1"/>
+              <w:left w:val="single" w:color="D1D5DB" w:sz="1"/>
+              <w:bottom w:val="single" w:color="D1D5DB" w:sz="1"/>
+              <w:right w:val="single" w:color="D1D5DB" w:sz="1"/>
+            </w:tcBorders>
+            <w:tcMar>
+              <w:top w:type="dxa" w:w="120"/>
+              <w:left w:type="dxa" w:w="120"/>
+              <w:bottom w:type="dxa" w:w="120"/>
+              <w:right w:type="dxa" w:w="120"/>
+            </w:tcMar>
+          </w:tcPr>
+          <w:p>
+            <w:pPr>
+              <w:spacing w:after="0" w:before="0" w:line="300"/>
+            </w:pPr>
+            <w:r>
+              <w:rPr>
+                <w:rFonts w:ascii="Arial" w:cs="Arial" w:eastAsia="Arial" w:hAnsi="Arial"/>
+                <w:color w:val="111827"/>
+                <w:sz w:val="22"/>
+                <w:szCs w:val="22"/>
+              </w:rPr>
+              <w:t xml:space="preserve">Azure Blob Storage or ADLS Gen2</w:t>
+            </w:r>
+          </w:p>
+        </w:tc>
+        <w:tc>
+          <w:tcPr>
+            <w:tcW w:type="dxa" w:w="3980"/>
+            <w:tcBorders>
+              <w:top w:val="single" w:color="D1D5DB" w:sz="1"/>
+              <w:left w:val="single" w:color="D1D5DB" w:sz="1"/>
+              <w:bottom w:val="single" w:color="D1D5DB" w:sz="1"/>
+              <w:right w:val="single" w:color="D1D5DB" w:sz="1"/>
+            </w:tcBorders>
+            <w:tcMar>
+              <w:top w:type="dxa" w:w="120"/>
+              <w:left w:type="dxa" w:w="120"/>
+              <w:bottom w:type="dxa" w:w="120"/>
+              <w:right w:type="dxa" w:w="120"/>
+            </w:tcMar>
+          </w:tcPr>
+          <w:p>
+            <w:pPr>
+              <w:spacing w:after="0" w:before="0" w:line="300"/>
+            </w:pPr>
+            <w:r>
+              <w:rPr>
+                <w:rFonts w:ascii="Arial" w:cs="Arial" w:eastAsia="Arial" w:hAnsi="Arial"/>
+                <w:color w:val="111827"/>
+                <w:sz w:val="22"/>
+                <w:szCs w:val="22"/>
+              </w:rPr>
+              <w:t xml:space="preserve">Stores durable evidence: prompts, tool calls, outputs, final answers, timings, errors, and run metadata.</w:t>
+            </w:r>
+          </w:p>
+        </w:tc>
+      </w:tr>
+      <w:tr>
+        <w:tc>
+          <w:tcPr>
+            <w:tcW w:type="dxa" w:w="1900"/>
+            <w:tcBorders>
+              <w:top w:val="single" w:color="D1D5DB" w:sz="1"/>
+              <w:left w:val="single" w:color="D1D5DB" w:sz="1"/>
+              <w:bottom w:val="single" w:color="D1D5DB" w:sz="1"/>
+              <w:right w:val="single" w:color="D1D5DB" w:sz="1"/>
+            </w:tcBorders>
+            <w:tcMar>
+              <w:top w:type="dxa" w:w="120"/>
+              <w:left w:type="dxa" w:w="120"/>
+              <w:bottom w:type="dxa" w:w="120"/>
+              <w:right w:type="dxa" w:w="120"/>
+            </w:tcMar>
+          </w:tcPr>
+          <w:p>
+            <w:pPr>
+              <w:spacing w:after="0" w:before="0" w:line="300"/>
+            </w:pPr>
+            <w:r>
+              <w:rPr>
+                <w:rFonts w:ascii="Arial" w:cs="Arial" w:eastAsia="Arial" w:hAnsi="Arial"/>
+                <w:color w:val="111827"/>
+                <w:sz w:val="22"/>
+                <w:szCs w:val="22"/>
+              </w:rPr>
+              <w:t xml:space="preserve">Scorecard store</w:t>
+            </w:r>
+          </w:p>
+        </w:tc>
+        <w:tc>
+          <w:tcPr>
+            <w:tcW w:type="dxa" w:w="4200"/>
+            <w:tcBorders>
+              <w:top w:val="single" w:color="D1D5DB" w:sz="1"/>
+              <w:left w:val="single" w:color="D1D5DB" w:sz="1"/>
+              <w:bottom w:val="single" w:color="D1D5DB" w:sz="1"/>
+              <w:right w:val="single" w:color="D1D5DB" w:sz="1"/>
+            </w:tcBorders>
+            <w:tcMar>
+              <w:top w:type="dxa" w:w="120"/>
+              <w:left w:type="dxa" w:w="120"/>
+              <w:bottom w:type="dxa" w:w="120"/>
+              <w:right w:type="dxa" w:w="120"/>
+            </w:tcMar>
+          </w:tcPr>
+          <w:p>
+            <w:pPr>
+              <w:spacing w:after="0" w:before="0" w:line="300"/>
+            </w:pPr>
+            <w:r>
+              <w:rPr>
+                <w:rFonts w:ascii="Arial" w:cs="Arial" w:eastAsia="Arial" w:hAnsi="Arial"/>
+                <w:color w:val="111827"/>
+                <w:sz w:val="22"/>
+                <w:szCs w:val="22"/>
+              </w:rPr>
+              <w:t xml:space="preserve">Git repository; Azure Blob; SQL table; Fabric Lakehouse</w:t>
+            </w:r>
+          </w:p>
+        </w:tc>
+        <w:tc>
+          <w:tcPr>
+            <w:tcW w:type="dxa" w:w="3980"/>
+            <w:tcBorders>
+              <w:top w:val="single" w:color="D1D5DB" w:sz="1"/>
+              <w:left w:val="single" w:color="D1D5DB" w:sz="1"/>
+              <w:bottom w:val="single" w:color="D1D5DB" w:sz="1"/>
+              <w:right w:val="single" w:color="D1D5DB" w:sz="1"/>
+            </w:tcBorders>
+            <w:tcMar>
+              <w:top w:type="dxa" w:w="120"/>
+              <w:left w:type="dxa" w:w="120"/>
+              <w:bottom w:type="dxa" w:w="120"/>
+              <w:right w:type="dxa" w:w="120"/>
+            </w:tcMar>
+          </w:tcPr>
+          <w:p>
+            <w:pPr>
+              <w:spacing w:after="0" w:before="0" w:line="300"/>
+            </w:pPr>
+            <w:r>
+              <w:rPr>
+                <w:rFonts w:ascii="Arial" w:cs="Arial" w:eastAsia="Arial" w:hAnsi="Arial"/>
+                <w:color w:val="111827"/>
+                <w:sz w:val="22"/>
+                <w:szCs w:val="22"/>
+              </w:rPr>
+              <w:t xml:space="preserve">Stores pass/fail results, metric values, config stamps, and run IDs for comparison.</w:t>
+            </w:r>
+          </w:p>
+        </w:tc>
+      </w:tr>
+      <w:tr>
+        <w:tc>
+          <w:tcPr>
+            <w:tcW w:type="dxa" w:w="1900"/>
+            <w:tcBorders>
+              <w:top w:val="single" w:color="D1D5DB" w:sz="1"/>
+              <w:left w:val="single" w:color="D1D5DB" w:sz="1"/>
+              <w:bottom w:val="single" w:color="D1D5DB" w:sz="1"/>
+              <w:right w:val="single" w:color="D1D5DB" w:sz="1"/>
+            </w:tcBorders>
+            <w:tcMar>
+              <w:top w:type="dxa" w:w="120"/>
+              <w:left w:type="dxa" w:w="120"/>
+              <w:bottom w:type="dxa" w:w="120"/>
+              <w:right w:type="dxa" w:w="120"/>
+            </w:tcMar>
+          </w:tcPr>
+          <w:p>
+            <w:pPr>
+              <w:spacing w:after="0" w:before="0" w:line="300"/>
+            </w:pPr>
+            <w:r>
+              <w:rPr>
+                <w:rFonts w:ascii="Arial" w:cs="Arial" w:eastAsia="Arial" w:hAnsi="Arial"/>
+                <w:color w:val="111827"/>
+                <w:sz w:val="22"/>
+                <w:szCs w:val="22"/>
+              </w:rPr>
+              <w:t xml:space="preserve">Code graders</w:t>
+            </w:r>
+          </w:p>
+        </w:tc>
+        <w:tc>
+          <w:tcPr>
+            <w:tcW w:type="dxa" w:w="4200"/>
+            <w:tcBorders>
+              <w:top w:val="single" w:color="D1D5DB" w:sz="1"/>
+              <w:left w:val="single" w:color="D1D5DB" w:sz="1"/>
+              <w:bottom w:val="single" w:color="D1D5DB" w:sz="1"/>
+              <w:right w:val="single" w:color="D1D5DB" w:sz="1"/>
+            </w:tcBorders>
+            <w:tcMar>
+              <w:top w:type="dxa" w:w="120"/>
+              <w:left w:type="dxa" w:w="120"/>
+              <w:bottom w:type="dxa" w:w="120"/>
+              <w:right w:type="dxa" w:w="120"/>
+            </w:tcMar>
+          </w:tcPr>
+          <w:p>
+            <w:pPr>
+              <w:spacing w:after="0" w:before="0" w:line="300"/>
+            </w:pPr>
+            <w:r>
+              <w:rPr>
+                <w:rFonts w:ascii="Arial" w:cs="Arial" w:eastAsia="Arial" w:hAnsi="Arial"/>
+                <w:color w:val="111827"/>
+                <w:sz w:val="22"/>
+                <w:szCs w:val="22"/>
+              </w:rPr>
+              <w:t xml:space="preserve">Python with pytest; TypeScript with Jest; custom validators</w:t>
+            </w:r>
+          </w:p>
+        </w:tc>
+        <w:tc>
+          <w:tcPr>
+            <w:tcW w:type="dxa" w:w="3980"/>
+            <w:tcBorders>
+              <w:top w:val="single" w:color="D1D5DB" w:sz="1"/>
+              <w:left w:val="single" w:color="D1D5DB" w:sz="1"/>
+              <w:bottom w:val="single" w:color="D1D5DB" w:sz="1"/>
+              <w:right w:val="single" w:color="D1D5DB" w:sz="1"/>
+            </w:tcBorders>
+            <w:tcMar>
+              <w:top w:type="dxa" w:w="120"/>
+              <w:left w:type="dxa" w:w="120"/>
+              <w:bottom w:type="dxa" w:w="120"/>
+              <w:right w:type="dxa" w:w="120"/>
+            </w:tcMar>
+          </w:tcPr>
+          <w:p>
+            <w:pPr>
+              <w:spacing w:after="0" w:before="0" w:line="300"/>
+            </w:pPr>
+            <w:r>
+              <w:rPr>
+                <w:rFonts w:ascii="Arial" w:cs="Arial" w:eastAsia="Arial" w:hAnsi="Arial"/>
+                <w:color w:val="111827"/>
+                <w:sz w:val="22"/>
+                <w:szCs w:val="22"/>
+              </w:rPr>
+              <w:t xml:space="preserve">Performs deterministic checks for end state, tool calls, forbidden actions, and factual correctness.</w:t>
+            </w:r>
+          </w:p>
+        </w:tc>
+      </w:tr>
+      <w:tr>
+        <w:tc>
+          <w:tcPr>
+            <w:tcW w:type="dxa" w:w="1900"/>
+            <w:tcBorders>
+              <w:top w:val="single" w:color="D1D5DB" w:sz="1"/>
+              <w:left w:val="single" w:color="D1D5DB" w:sz="1"/>
+              <w:bottom w:val="single" w:color="D1D5DB" w:sz="1"/>
+              <w:right w:val="single" w:color="D1D5DB" w:sz="1"/>
+            </w:tcBorders>
+            <w:tcMar>
+              <w:top w:type="dxa" w:w="120"/>
+              <w:left w:type="dxa" w:w="120"/>
+              <w:bottom w:type="dxa" w:w="120"/>
+              <w:right w:type="dxa" w:w="120"/>
+            </w:tcMar>
+          </w:tcPr>
+          <w:p>
+            <w:pPr>
+              <w:spacing w:after="0" w:before="0" w:line="300"/>
+            </w:pPr>
+            <w:r>
+              <w:rPr>
+                <w:rFonts w:ascii="Arial" w:cs="Arial" w:eastAsia="Arial" w:hAnsi="Arial"/>
+                <w:color w:val="111827"/>
+                <w:sz w:val="22"/>
+                <w:szCs w:val="22"/>
+              </w:rPr>
+              <w:t xml:space="preserve">LLM judges</w:t>
+            </w:r>
+          </w:p>
+        </w:tc>
+        <w:tc>
+          <w:tcPr>
+            <w:tcW w:type="dxa" w:w="4200"/>
+            <w:tcBorders>
+              <w:top w:val="single" w:color="D1D5DB" w:sz="1"/>
+              <w:left w:val="single" w:color="D1D5DB" w:sz="1"/>
+              <w:bottom w:val="single" w:color="D1D5DB" w:sz="1"/>
+              <w:right w:val="single" w:color="D1D5DB" w:sz="1"/>
+            </w:tcBorders>
+            <w:tcMar>
+              <w:top w:type="dxa" w:w="120"/>
+              <w:left w:type="dxa" w:w="120"/>
+              <w:bottom w:type="dxa" w:w="120"/>
+              <w:right w:type="dxa" w:w="120"/>
+            </w:tcMar>
+          </w:tcPr>
+          <w:p>
+            <w:pPr>
+              <w:spacing w:after="0" w:before="0" w:line="300"/>
+            </w:pPr>
+            <w:r>
+              <w:rPr>
+                <w:rFonts w:ascii="Arial" w:cs="Arial" w:eastAsia="Arial" w:hAnsi="Arial"/>
+                <w:color w:val="111827"/>
+                <w:sz w:val="22"/>
+                <w:szCs w:val="22"/>
+              </w:rPr>
+              <w:t xml:space="preserve">Azure OpenAI; Azure AI Foundry evaluators</w:t>
+            </w:r>
+          </w:p>
+        </w:tc>
+        <w:tc>
+          <w:tcPr>
+            <w:tcW w:type="dxa" w:w="3980"/>
+            <w:tcBorders>
+              <w:top w:val="single" w:color="D1D5DB" w:sz="1"/>
+              <w:left w:val="single" w:color="D1D5DB" w:sz="1"/>
+              <w:bottom w:val="single" w:color="D1D5DB" w:sz="1"/>
+              <w:right w:val="single" w:color="D1D5DB" w:sz="1"/>
+            </w:tcBorders>
+            <w:tcMar>
+              <w:top w:type="dxa" w:w="120"/>
+              <w:left w:type="dxa" w:w="120"/>
+              <w:bottom w:type="dxa" w:w="120"/>
+              <w:right w:type="dxa" w:w="120"/>
+            </w:tcMar>
+          </w:tcPr>
+          <w:p>
+            <w:pPr>
+              <w:spacing w:after="0" w:before="0" w:line="300"/>
+            </w:pPr>
+            <w:r>
+              <w:rPr>
+                <w:rFonts w:ascii="Arial" w:cs="Arial" w:eastAsia="Arial" w:hAnsi="Arial"/>
+                <w:color w:val="111827"/>
+                <w:sz w:val="22"/>
+                <w:szCs w:val="22"/>
+              </w:rPr>
+              <w:t xml:space="preserve">Grades groundedness, relevance, completeness, route quality, and language quality using rubrics.</w:t>
+            </w:r>
+          </w:p>
+        </w:tc>
+      </w:tr>
+      <w:tr>
+        <w:tc>
+          <w:tcPr>
+            <w:tcW w:type="dxa" w:w="1900"/>
+            <w:tcBorders>
+              <w:top w:val="single" w:color="D1D5DB" w:sz="1"/>
+              <w:left w:val="single" w:color="D1D5DB" w:sz="1"/>
+              <w:bottom w:val="single" w:color="D1D5DB" w:sz="1"/>
+              <w:right w:val="single" w:color="D1D5DB" w:sz="1"/>
+            </w:tcBorders>
+            <w:tcMar>
+              <w:top w:type="dxa" w:w="120"/>
+              <w:left w:type="dxa" w:w="120"/>
+              <w:bottom w:type="dxa" w:w="120"/>
+              <w:right w:type="dxa" w:w="120"/>
+            </w:tcMar>
+          </w:tcPr>
+          <w:p>
+            <w:pPr>
+              <w:spacing w:after="0" w:before="0" w:line="300"/>
+            </w:pPr>
+            <w:r>
+              <w:rPr>
+                <w:rFonts w:ascii="Arial" w:cs="Arial" w:eastAsia="Arial" w:hAnsi="Arial"/>
+                <w:color w:val="111827"/>
+                <w:sz w:val="22"/>
+                <w:szCs w:val="22"/>
+              </w:rPr>
+              <w:t xml:space="preserve">Safety evals</w:t>
+            </w:r>
+          </w:p>
+        </w:tc>
+        <w:tc>
+          <w:tcPr>
+            <w:tcW w:type="dxa" w:w="4200"/>
+            <w:tcBorders>
+              <w:top w:val="single" w:color="D1D5DB" w:sz="1"/>
+              <w:left w:val="single" w:color="D1D5DB" w:sz="1"/>
+              <w:bottom w:val="single" w:color="D1D5DB" w:sz="1"/>
+              <w:right w:val="single" w:color="D1D5DB" w:sz="1"/>
+            </w:tcBorders>
+            <w:tcMar>
+              <w:top w:type="dxa" w:w="120"/>
+              <w:left w:type="dxa" w:w="120"/>
+              <w:bottom w:type="dxa" w:w="120"/>
+              <w:right w:type="dxa" w:w="120"/>
+            </w:tcMar>
+          </w:tcPr>
+          <w:p>
+            <w:pPr>
+              <w:spacing w:after="0" w:before="0" w:line="300"/>
+            </w:pPr>
+            <w:r>
+              <w:rPr>
+                <w:rFonts w:ascii="Arial" w:cs="Arial" w:eastAsia="Arial" w:hAnsi="Arial"/>
+                <w:color w:val="111827"/>
+                <w:sz w:val="22"/>
+                <w:szCs w:val="22"/>
+              </w:rPr>
+              <w:t xml:space="preserve">Azure AI Foundry evaluators; PyRIT; OWASP LLM test cases; prompt-injection suites</w:t>
+            </w:r>
+          </w:p>
+        </w:tc>
+        <w:tc>
+          <w:tcPr>
+            <w:tcW w:type="dxa" w:w="3980"/>
+            <w:tcBorders>
+              <w:top w:val="single" w:color="D1D5DB" w:sz="1"/>
+              <w:left w:val="single" w:color="D1D5DB" w:sz="1"/>
+              <w:bottom w:val="single" w:color="D1D5DB" w:sz="1"/>
+              <w:right w:val="single" w:color="D1D5DB" w:sz="1"/>
+            </w:tcBorders>
+            <w:tcMar>
+              <w:top w:type="dxa" w:w="120"/>
+              <w:left w:type="dxa" w:w="120"/>
+              <w:bottom w:type="dxa" w:w="120"/>
+              <w:right w:type="dxa" w:w="120"/>
+            </w:tcMar>
+          </w:tcPr>
+          <w:p>
+            <w:pPr>
+              <w:spacing w:after="0" w:before="0" w:line="300"/>
+            </w:pPr>
+            <w:r>
+              <w:rPr>
+                <w:rFonts w:ascii="Arial" w:cs="Arial" w:eastAsia="Arial" w:hAnsi="Arial"/>
+                <w:color w:val="111827"/>
+                <w:sz w:val="22"/>
+                <w:szCs w:val="22"/>
+              </w:rPr>
+              <w:t xml:space="preserve">Tests leakage, unsafe actions, jailbreak resistance, prompt injection, and policy violations.</w:t>
+            </w:r>
+          </w:p>
+        </w:tc>
+      </w:tr>
+      <w:tr>
+        <w:tc>
+          <w:tcPr>
+            <w:tcW w:type="dxa" w:w="1900"/>
+            <w:tcBorders>
+              <w:top w:val="single" w:color="D1D5DB" w:sz="1"/>
+              <w:left w:val="single" w:color="D1D5DB" w:sz="1"/>
+              <w:bottom w:val="single" w:color="D1D5DB" w:sz="1"/>
+              <w:right w:val="single" w:color="D1D5DB" w:sz="1"/>
+            </w:tcBorders>
+            <w:tcMar>
+              <w:top w:type="dxa" w:w="120"/>
+              <w:left w:type="dxa" w:w="120"/>
+              <w:bottom w:type="dxa" w:w="120"/>
+              <w:right w:type="dxa" w:w="120"/>
+            </w:tcMar>
+          </w:tcPr>
+          <w:p>
+            <w:pPr>
+              <w:spacing w:after="0" w:before="0" w:line="300"/>
+            </w:pPr>
+            <w:r>
+              <w:rPr>
+                <w:rFonts w:ascii="Arial" w:cs="Arial" w:eastAsia="Arial" w:hAnsi="Arial"/>
+                <w:color w:val="111827"/>
+                <w:sz w:val="22"/>
+                <w:szCs w:val="22"/>
+              </w:rPr>
+              <w:t xml:space="preserve">Observability</w:t>
+            </w:r>
+          </w:p>
+        </w:tc>
+        <w:tc>
+          <w:tcPr>
+            <w:tcW w:type="dxa" w:w="4200"/>
+            <w:tcBorders>
+              <w:top w:val="single" w:color="D1D5DB" w:sz="1"/>
+              <w:left w:val="single" w:color="D1D5DB" w:sz="1"/>
+              <w:bottom w:val="single" w:color="D1D5DB" w:sz="1"/>
+              <w:right w:val="single" w:color="D1D5DB" w:sz="1"/>
+            </w:tcBorders>
+            <w:tcMar>
+              <w:top w:type="dxa" w:w="120"/>
+              <w:left w:type="dxa" w:w="120"/>
+              <w:bottom w:type="dxa" w:w="120"/>
+              <w:right w:type="dxa" w:w="120"/>
+            </w:tcMar>
+          </w:tcPr>
+          <w:p>
+            <w:pPr>
+              <w:spacing w:after="0" w:before="0" w:line="300"/>
+            </w:pPr>
+            <w:r>
+              <w:rPr>
+                <w:rFonts w:ascii="Arial" w:cs="Arial" w:eastAsia="Arial" w:hAnsi="Arial"/>
+                <w:color w:val="111827"/>
+                <w:sz w:val="22"/>
+                <w:szCs w:val="22"/>
+              </w:rPr>
+              <w:t xml:space="preserve">Application Insights; Azure Monitor; OpenTelemetry</w:t>
+            </w:r>
+          </w:p>
+        </w:tc>
+        <w:tc>
+          <w:tcPr>
+            <w:tcW w:type="dxa" w:w="3980"/>
+            <w:tcBorders>
+              <w:top w:val="single" w:color="D1D5DB" w:sz="1"/>
+              <w:left w:val="single" w:color="D1D5DB" w:sz="1"/>
+              <w:bottom w:val="single" w:color="D1D5DB" w:sz="1"/>
+              <w:right w:val="single" w:color="D1D5DB" w:sz="1"/>
+            </w:tcBorders>
+            <w:tcMar>
+              <w:top w:type="dxa" w:w="120"/>
+              <w:left w:type="dxa" w:w="120"/>
+              <w:bottom w:type="dxa" w:w="120"/>
+              <w:right w:type="dxa" w:w="120"/>
+            </w:tcMar>
+          </w:tcPr>
+          <w:p>
+            <w:pPr>
+              <w:spacing w:after="0" w:before="0" w:line="300"/>
+            </w:pPr>
+            <w:r>
+              <w:rPr>
+                <w:rFonts w:ascii="Arial" w:cs="Arial" w:eastAsia="Arial" w:hAnsi="Arial"/>
+                <w:color w:val="111827"/>
+                <w:sz w:val="22"/>
+                <w:szCs w:val="22"/>
+              </w:rPr>
+              <w:t xml:space="preserve">Tracks latency, token usage, tool calls, errors, cost, drift, and regressions.</w:t>
+            </w:r>
+          </w:p>
+        </w:tc>
+      </w:tr>
+      <w:tr>
+        <w:tc>
+          <w:tcPr>
+            <w:tcW w:type="dxa" w:w="1900"/>
+            <w:tcBorders>
+              <w:top w:val="single" w:color="D1D5DB" w:sz="1"/>
+              <w:left w:val="single" w:color="D1D5DB" w:sz="1"/>
+              <w:bottom w:val="single" w:color="D1D5DB" w:sz="1"/>
+              <w:right w:val="single" w:color="D1D5DB" w:sz="1"/>
+            </w:tcBorders>
+            <w:tcMar>
+              <w:top w:type="dxa" w:w="120"/>
+              <w:left w:type="dxa" w:w="120"/>
+              <w:bottom w:type="dxa" w:w="120"/>
+              <w:right w:type="dxa" w:w="120"/>
+            </w:tcMar>
+          </w:tcPr>
+          <w:p>
+            <w:pPr>
+              <w:spacing w:after="0" w:before="0" w:line="300"/>
+            </w:pPr>
+            <w:r>
+              <w:rPr>
+                <w:rFonts w:ascii="Arial" w:cs="Arial" w:eastAsia="Arial" w:hAnsi="Arial"/>
+                <w:color w:val="111827"/>
+                <w:sz w:val="22"/>
+                <w:szCs w:val="22"/>
+              </w:rPr>
+              <w:t xml:space="preserve">CI/CD integration</w:t>
+            </w:r>
+          </w:p>
+        </w:tc>
+        <w:tc>
+          <w:tcPr>
+            <w:tcW w:type="dxa" w:w="4200"/>
+            <w:tcBorders>
+              <w:top w:val="single" w:color="D1D5DB" w:sz="1"/>
+              <w:left w:val="single" w:color="D1D5DB" w:sz="1"/>
+              <w:bottom w:val="single" w:color="D1D5DB" w:sz="1"/>
+              <w:right w:val="single" w:color="D1D5DB" w:sz="1"/>
+            </w:tcBorders>
+            <w:tcMar>
+              <w:top w:type="dxa" w:w="120"/>
+              <w:left w:type="dxa" w:w="120"/>
+              <w:bottom w:type="dxa" w:w="120"/>
+              <w:right w:type="dxa" w:w="120"/>
+            </w:tcMar>
+          </w:tcPr>
+          <w:p>
+            <w:pPr>
+              <w:spacing w:after="0" w:before="0" w:line="300"/>
+            </w:pPr>
+            <w:r>
+              <w:rPr>
+                <w:rFonts w:ascii="Arial" w:cs="Arial" w:eastAsia="Arial" w:hAnsi="Arial"/>
+                <w:color w:val="111827"/>
+                <w:sz w:val="22"/>
+                <w:szCs w:val="22"/>
+              </w:rPr>
+              <w:t xml:space="preserve">GitHub Actions or Azure DevOps</w:t>
+            </w:r>
+          </w:p>
+        </w:tc>
+        <w:tc>
+          <w:tcPr>
+            <w:tcW w:type="dxa" w:w="3980"/>
+            <w:tcBorders>
+              <w:top w:val="single" w:color="D1D5DB" w:sz="1"/>
+              <w:left w:val="single" w:color="D1D5DB" w:sz="1"/>
+              <w:bottom w:val="single" w:color="D1D5DB" w:sz="1"/>
+              <w:right w:val="single" w:color="D1D5DB" w:sz="1"/>
+            </w:tcBorders>
+            <w:tcMar>
+              <w:top w:type="dxa" w:w="120"/>
+              <w:left w:type="dxa" w:w="120"/>
+              <w:bottom w:type="dxa" w:w="120"/>
+              <w:right w:type="dxa" w:w="120"/>
+            </w:tcMar>
+          </w:tcPr>
+          <w:p>
+            <w:pPr>
+              <w:spacing w:after="0" w:before="0" w:line="300"/>
+            </w:pPr>
+            <w:r>
+              <w:rPr>
+                <w:rFonts w:ascii="Arial" w:cs="Arial" w:eastAsia="Arial" w:hAnsi="Arial"/>
+                <w:color w:val="111827"/>
+                <w:sz w:val="22"/>
+                <w:szCs w:val="22"/>
+              </w:rPr>
+              <w:t xml:space="preserve">Runs regression and safety evals before behavior-affecting changes ship.</w:t>
+            </w:r>
+          </w:p>
+        </w:tc>
+      </w:tr>
+      <w:tr>
+        <w:tc>
+          <w:tcPr>
+            <w:tcW w:type="dxa" w:w="1900"/>
+            <w:tcBorders>
+              <w:top w:val="single" w:color="D1D5DB" w:sz="1"/>
+              <w:left w:val="single" w:color="D1D5DB" w:sz="1"/>
+              <w:bottom w:val="single" w:color="D1D5DB" w:sz="1"/>
+              <w:right w:val="single" w:color="D1D5DB" w:sz="1"/>
+            </w:tcBorders>
+            <w:tcMar>
+              <w:top w:type="dxa" w:w="120"/>
+              <w:left w:type="dxa" w:w="120"/>
+              <w:bottom w:type="dxa" w:w="120"/>
+              <w:right w:type="dxa" w:w="120"/>
+            </w:tcMar>
+          </w:tcPr>
+          <w:p>
+            <w:pPr>
+              <w:spacing w:after="0" w:before="0" w:line="300"/>
+            </w:pPr>
+            <w:r>
+              <w:rPr>
+                <w:rFonts w:ascii="Arial" w:cs="Arial" w:eastAsia="Arial" w:hAnsi="Arial"/>
+                <w:color w:val="111827"/>
+                <w:sz w:val="22"/>
+                <w:szCs w:val="22"/>
+              </w:rPr>
+              <w:t xml:space="preserve">Reporting</w:t>
+            </w:r>
+          </w:p>
+        </w:tc>
+        <w:tc>
+          <w:tcPr>
+            <w:tcW w:type="dxa" w:w="4200"/>
+            <w:tcBorders>
+              <w:top w:val="single" w:color="D1D5DB" w:sz="1"/>
+              <w:left w:val="single" w:color="D1D5DB" w:sz="1"/>
+              <w:bottom w:val="single" w:color="D1D5DB" w:sz="1"/>
+              <w:right w:val="single" w:color="D1D5DB" w:sz="1"/>
+            </w:tcBorders>
+            <w:tcMar>
+              <w:top w:type="dxa" w:w="120"/>
+              <w:left w:type="dxa" w:w="120"/>
+              <w:bottom w:type="dxa" w:w="120"/>
+              <w:right w:type="dxa" w:w="120"/>
+            </w:tcMar>
+          </w:tcPr>
+          <w:p>
+            <w:pPr>
+              <w:spacing w:after="0" w:before="0" w:line="300"/>
+            </w:pPr>
+            <w:r>
+              <w:rPr>
+                <w:rFonts w:ascii="Arial" w:cs="Arial" w:eastAsia="Arial" w:hAnsi="Arial"/>
+                <w:color w:val="111827"/>
+                <w:sz w:val="22"/>
+                <w:szCs w:val="22"/>
+              </w:rPr>
+              <w:t xml:space="preserve">Power BI; Microsoft Fabric Lakehouse; markdown scorecards; App Insights dashboards</w:t>
+            </w:r>
+          </w:p>
+        </w:tc>
+        <w:tc>
+          <w:tcPr>
+            <w:tcW w:type="dxa" w:w="3980"/>
+            <w:tcBorders>
+              <w:top w:val="single" w:color="D1D5DB" w:sz="1"/>
+              <w:left w:val="single" w:color="D1D5DB" w:sz="1"/>
+              <w:bottom w:val="single" w:color="D1D5DB" w:sz="1"/>
+              <w:right w:val="single" w:color="D1D5DB" w:sz="1"/>
+            </w:tcBorders>
+            <w:tcMar>
+              <w:top w:type="dxa" w:w="120"/>
+              <w:left w:type="dxa" w:w="120"/>
+              <w:bottom w:type="dxa" w:w="120"/>
+              <w:right w:type="dxa" w:w="120"/>
+            </w:tcMar>
+          </w:tcPr>
+          <w:p>
+            <w:pPr>
+              <w:spacing w:after="0" w:before="0" w:line="300"/>
+            </w:pPr>
+            <w:r>
+              <w:rPr>
+                <w:rFonts w:ascii="Arial" w:cs="Arial" w:eastAsia="Arial" w:hAnsi="Arial"/>
+                <w:color w:val="111827"/>
+                <w:sz w:val="22"/>
+                <w:szCs w:val="22"/>
+              </w:rPr>
+              <w:t xml:space="preserve">Shows pass rates, trends, costs, latency, and failure clusters.</w:t>
+            </w:r>
+          </w:p>
+        </w:tc>
+      </w:tr>
+    </w:tbl>
+    <w:p>
+      <w:pPr>
+        <w:spacing w:after="120"/>
+      </w:pPr>
+    </w:p>
+    <w:p>
+      <w:pPr>
+        <w:pStyle w:val="Heading2"/>
+        <w:spacing w:after="120" w:before="80" w:line="300"/>
+      </w:pPr>
+      <w:r>
+        <w:rPr>
+          <w:rFonts w:ascii="Arial" w:cs="Arial" w:eastAsia="Arial" w:hAnsi="Arial"/>
+          <w:color w:val="111827"/>
+          <w:sz w:val="22"/>
+          <w:szCs w:val="22"/>
+        </w:rPr>
+        <w:t xml:space="preserve">Minimal practical stack</w:t>
+      </w:r>
+    </w:p>
+    <w:p>
+      <w:pPr>
+        <w:spacing w:after="120" w:before="80" w:line="300"/>
+      </w:pPr>
+      <w:r>
+        <w:rPr>
+          <w:rFonts w:ascii="Arial" w:cs="Arial" w:eastAsia="Arial" w:hAnsi="Arial"/>
+          <w:color w:val="111827"/>
+          <w:sz w:val="22"/>
+          <w:szCs w:val="22"/>
+        </w:rPr>
+        <w:t xml:space="preserve">For a first implementation, keep the stack simple and evidence-driven.</w:t>
+      </w:r>
+    </w:p>
+    <w:p>
+      <w:pPr>
+        <w:spacing w:after="80" w:line="300"/>
+        <w:ind w:left="360"/>
+      </w:pPr>
+      <w:r>
+        <w:rPr>
+          <w:rFonts w:ascii="Arial" w:cs="Arial" w:eastAsia="Arial" w:hAnsi="Arial"/>
+          <w:color w:val="111827"/>
+          <w:sz w:val="22"/>
+          <w:szCs w:val="22"/>
+        </w:rPr>
+        <w:t xml:space="preserve">- GitHub repository for eval task files, grader code, config stamps, and scorecards.</w:t>
+      </w:r>
+    </w:p>
+    <w:p>
+      <w:pPr>
+        <w:spacing w:after="80" w:line="300"/>
+        <w:ind w:left="360"/>
+      </w:pPr>
+      <w:r>
+        <w:rPr>
+          <w:rFonts w:ascii="Arial" w:cs="Arial" w:eastAsia="Arial" w:hAnsi="Arial"/>
+          <w:color w:val="111827"/>
+          <w:sz w:val="22"/>
+          <w:szCs w:val="22"/>
+        </w:rPr>
+        <w:t xml:space="preserve">- Python or TypeScript eval runner that runs each task, calls the agent, records transcript JSON, and invokes graders.</w:t>
+      </w:r>
+    </w:p>
+    <w:p>
+      <w:pPr>
+        <w:spacing w:after="80" w:line="300"/>
+        <w:ind w:left="360"/>
+      </w:pPr>
+      <w:r>
+        <w:rPr>
+          <w:rFonts w:ascii="Arial" w:cs="Arial" w:eastAsia="Arial" w:hAnsi="Arial"/>
+          <w:color w:val="111827"/>
+          <w:sz w:val="22"/>
+          <w:szCs w:val="22"/>
+        </w:rPr>
+        <w:t xml:space="preserve">- Azure Blob Storage or ADLS Gen2 for transcript bundles keyed by run ID.</w:t>
+      </w:r>
+    </w:p>
+    <w:p>
+      <w:pPr>
+        <w:spacing w:after="80" w:line="300"/>
+        <w:ind w:left="360"/>
+      </w:pPr>
+      <w:r>
+        <w:rPr>
+          <w:rFonts w:ascii="Arial" w:cs="Arial" w:eastAsia="Arial" w:hAnsi="Arial"/>
+          <w:color w:val="111827"/>
+          <w:sz w:val="22"/>
+          <w:szCs w:val="22"/>
+        </w:rPr>
+        <w:t xml:space="preserve">- pytest or Jest for deterministic code graders.</w:t>
+      </w:r>
+    </w:p>
+    <w:p>
+      <w:pPr>
+        <w:spacing w:after="80" w:line="300"/>
+        <w:ind w:left="360"/>
+      </w:pPr>
+      <w:r>
+        <w:rPr>
+          <w:rFonts w:ascii="Arial" w:cs="Arial" w:eastAsia="Arial" w:hAnsi="Arial"/>
+          <w:color w:val="111827"/>
+          <w:sz w:val="22"/>
+          <w:szCs w:val="22"/>
+        </w:rPr>
+        <w:t xml:space="preserve">- Azure OpenAI or Azure AI Foundry evaluators for judge-based grading.</w:t>
+      </w:r>
+    </w:p>
+    <w:p>
+      <w:pPr>
+        <w:spacing w:after="80" w:line="300"/>
+        <w:ind w:left="360"/>
+      </w:pPr>
+      <w:r>
+        <w:rPr>
+          <w:rFonts w:ascii="Arial" w:cs="Arial" w:eastAsia="Arial" w:hAnsi="Arial"/>
+          <w:color w:val="111827"/>
+          <w:sz w:val="22"/>
+          <w:szCs w:val="22"/>
+        </w:rPr>
+        <w:t xml:space="preserve">- GitHub Actions or Azure DevOps for pull request, release, and scheduled execution.</w:t>
+      </w:r>
+    </w:p>
+    <w:p>
+      <w:pPr>
+        <w:spacing w:after="80" w:line="300"/>
+        <w:ind w:left="360"/>
+      </w:pPr>
+      <w:r>
+        <w:rPr>
+          <w:rFonts w:ascii="Arial" w:cs="Arial" w:eastAsia="Arial" w:hAnsi="Arial"/>
+          <w:color w:val="111827"/>
+          <w:sz w:val="22"/>
+          <w:szCs w:val="22"/>
+        </w:rPr>
+        <w:t xml:space="preserve">- Application Insights for traces, latency, token usage, tool calls, and operational telemetry.</w:t>
+      </w:r>
+    </w:p>
+    <w:p>
+      <w:pPr>
+        <w:spacing w:after="120"/>
+      </w:pPr>
+    </w:p>
+    <w:p>
+      <w:pPr>
+        <w:pStyle w:val="Heading2"/>
+        <w:spacing w:after="120" w:before="80" w:line="300"/>
+      </w:pPr>
+      <w:r>
+        <w:rPr>
+          <w:rFonts w:ascii="Arial" w:cs="Arial" w:eastAsia="Arial" w:hAnsi="Arial"/>
+          <w:color w:val="111827"/>
+          <w:sz w:val="22"/>
+          <w:szCs w:val="22"/>
+        </w:rPr>
+        <w:t xml:space="preserve">Recommended Azure-oriented architecture</w:t>
+      </w:r>
+    </w:p>
+    <w:tbl>
+      <w:tblPr>
+        <w:tblW w:type="dxa" w:w="10080"/>
+        <w:tblBorders>
+          <w:top w:val="single" w:color="auto" w:sz="4"/>
+          <w:left w:val="single" w:color="auto" w:sz="4"/>
+          <w:bottom w:val="single" w:color="auto" w:sz="4"/>
+          <w:right w:val="single" w:color="auto" w:sz="4"/>
+          <w:insideH w:val="single" w:color="auto" w:sz="4"/>
+          <w:insideV w:val="single" w:color="auto" w:sz="4"/>
+        </w:tblBorders>
+      </w:tblPr>
+      <w:tblGrid>
+        <w:gridCol w:w="10080"/>
+      </w:tblGrid>
+      <w:tr>
+        <w:tc>
+          <w:tcPr>
+            <w:tcW w:type="dxa" w:w="10080"/>
+            <w:tcBorders>
+              <w:top w:val="single" w:color="1F4E79" w:sz="1"/>
+              <w:left w:val="single" w:color="1F4E79" w:sz="12"/>
+              <w:bottom w:val="single" w:color="1F4E79" w:sz="1"/>
+              <w:right w:val="single" w:color="1F4E79" w:sz="1"/>
+            </w:tcBorders>
+            <w:shd w:fill="D9EAF7" w:val="clear"/>
+            <w:tcMar>
+              <w:top w:type="dxa" w:w="180"/>
+              <w:left w:type="dxa" w:w="220"/>
+              <w:bottom w:type="dxa" w:w="180"/>
+              <w:right w:type="dxa" w:w="220"/>
+            </w:tcMar>
+          </w:tcPr>
+          <w:p>
+            <w:pPr>
+              <w:spacing w:after="80" w:before="0" w:line="300"/>
+            </w:pPr>
+            <w:r>
+              <w:rPr>
+                <w:rFonts w:ascii="Arial" w:cs="Arial" w:eastAsia="Arial" w:hAnsi="Arial"/>
+                <w:b/>
+                <w:bCs/>
+                <w:color w:val="1F4E79"/>
+                <w:sz w:val="22"/>
+                <w:szCs w:val="22"/>
+              </w:rPr>
+              <w:t xml:space="preserve">Reference flow</w:t>
+            </w:r>
+          </w:p>
+          <w:p>
+            <w:pPr>
+              <w:spacing w:after="0" w:before="0" w:line="300"/>
+            </w:pPr>
+            <w:r>
+              <w:rPr>
+                <w:rFonts w:ascii="Arial" w:cs="Arial" w:eastAsia="Arial" w:hAnsi="Arial"/>
+                <w:color w:val="111827"/>
+                <w:sz w:val="22"/>
+                <w:szCs w:val="22"/>
+              </w:rPr>
+              <w:t xml:space="preserve">GitHub or Azure DevOps triggers the eval runner. The runner invokes the agent under test against a controlled environment. The run produces a transcript bundle in Azure Blob Storage or ADLS Gen2. Code graders, LLM judges, and safety checks evaluate the transcript. Results are written to scorecards in Git, Blob, SQL, or Fabric. Dashboards in Power BI, Fabric, App Insights, or Azure Monitor show trends and regressions.</w:t>
+            </w:r>
+          </w:p>
+        </w:tc>
+      </w:tr>
+    </w:tbl>
+    <w:p>
+      <w:pPr>
+        <w:pStyle w:val="Heading2"/>
+        <w:spacing w:after="120" w:before="80" w:line="300"/>
+      </w:pPr>
+      <w:r>
+        <w:rPr>
+          <w:rFonts w:ascii="Arial" w:cs="Arial" w:eastAsia="Arial" w:hAnsi="Arial"/>
+          <w:color w:val="111827"/>
+          <w:sz w:val="22"/>
+          <w:szCs w:val="22"/>
+        </w:rPr>
+        <w:t xml:space="preserve">Recommended starting point</w:t>
+      </w:r>
+    </w:p>
+    <w:p>
+      <w:pPr>
+        <w:spacing w:after="80" w:line="300"/>
+        <w:ind w:left="360"/>
+      </w:pPr>
+      <w:r>
+        <w:rPr>
+          <w:rFonts w:ascii="Arial" w:cs="Arial" w:eastAsia="Arial" w:hAnsi="Arial"/>
+          <w:color w:val="111827"/>
+          <w:sz w:val="22"/>
+          <w:szCs w:val="22"/>
+        </w:rPr>
+        <w:t xml:space="preserve">- Start with Azure Blob Storage or ADLS Gen2 for transcripts.</w:t>
+      </w:r>
+    </w:p>
+    <w:p>
+      <w:pPr>
+        <w:spacing w:after="80" w:line="300"/>
+        <w:ind w:left="360"/>
+      </w:pPr>
+      <w:r>
+        <w:rPr>
+          <w:rFonts w:ascii="Arial" w:cs="Arial" w:eastAsia="Arial" w:hAnsi="Arial"/>
+          <w:color w:val="111827"/>
+          <w:sz w:val="22"/>
+          <w:szCs w:val="22"/>
+        </w:rPr>
+        <w:t xml:space="preserve">- Use GitHub Actions for CI execution, or Azure DevOps if that is the team standard.</w:t>
+      </w:r>
+    </w:p>
+    <w:p>
+      <w:pPr>
+        <w:spacing w:after="80" w:line="300"/>
+        <w:ind w:left="360"/>
+      </w:pPr>
+      <w:r>
+        <w:rPr>
+          <w:rFonts w:ascii="Arial" w:cs="Arial" w:eastAsia="Arial" w:hAnsi="Arial"/>
+          <w:color w:val="111827"/>
+          <w:sz w:val="22"/>
+          <w:szCs w:val="22"/>
+        </w:rPr>
+        <w:t xml:space="preserve">- Use Python pytest for deterministic graders.</w:t>
+      </w:r>
+    </w:p>
+    <w:p>
+      <w:pPr>
+        <w:spacing w:after="80" w:line="300"/>
+        <w:ind w:left="360"/>
+      </w:pPr>
+      <w:r>
+        <w:rPr>
+          <w:rFonts w:ascii="Arial" w:cs="Arial" w:eastAsia="Arial" w:hAnsi="Arial"/>
+          <w:color w:val="111827"/>
+          <w:sz w:val="22"/>
+          <w:szCs w:val="22"/>
+        </w:rPr>
+        <w:t xml:space="preserve">- Use Azure OpenAI or Foundry evaluators for judge-based grading.</w:t>
+      </w:r>
+    </w:p>
+    <w:p>
+      <w:pPr>
+        <w:spacing w:after="80" w:line="300"/>
+        <w:ind w:left="360"/>
+      </w:pPr>
+      <w:r>
+        <w:rPr>
+          <w:rFonts w:ascii="Arial" w:cs="Arial" w:eastAsia="Arial" w:hAnsi="Arial"/>
+          <w:color w:val="111827"/>
+          <w:sz w:val="22"/>
+          <w:szCs w:val="22"/>
+        </w:rPr>
+        <w:t xml:space="preserve">- Use Application Insights for traces, cost, latency, and tool-call telemetry.</w:t>
+      </w:r>
+    </w:p>
+    <w:p>
+      <w:pPr>
+        <w:spacing w:after="80" w:line="300"/>
+        <w:ind w:left="360"/>
+      </w:pPr>
+      <w:r>
+        <w:rPr>
+          <w:rFonts w:ascii="Arial" w:cs="Arial" w:eastAsia="Arial" w:hAnsi="Arial"/>
+          <w:color w:val="111827"/>
+          <w:sz w:val="22"/>
+          <w:szCs w:val="22"/>
+        </w:rPr>
+        <w:t xml:space="preserve">- Add Power BI or Microsoft Fabric dashboards after the first scorecards are stable.</w:t>
+      </w:r>
+    </w:p>
+    <w:tbl>
+      <w:tblPr>
+        <w:tblW w:type="dxa" w:w="10080"/>
+        <w:tblBorders>
+          <w:top w:val="single" w:color="auto" w:sz="4"/>
+          <w:left w:val="single" w:color="auto" w:sz="4"/>
+          <w:bottom w:val="single" w:color="auto" w:sz="4"/>
+          <w:right w:val="single" w:color="auto" w:sz="4"/>
+          <w:insideH w:val="single" w:color="auto" w:sz="4"/>
+          <w:insideV w:val="single" w:color="auto" w:sz="4"/>
+        </w:tblBorders>
+      </w:tblPr>
+      <w:tblGrid>
+        <w:gridCol w:w="10080"/>
+      </w:tblGrid>
+      <w:tr>
+        <w:tc>
+          <w:tcPr>
+            <w:tcW w:type="dxa" w:w="10080"/>
+            <w:tcBorders>
+              <w:top w:val="single" w:color="0F766E" w:sz="1"/>
+              <w:left w:val="single" w:color="0F766E" w:sz="12"/>
+              <w:bottom w:val="single" w:color="0F766E" w:sz="1"/>
+              <w:right w:val="single" w:color="0F766E" w:sz="1"/>
+            </w:tcBorders>
+            <w:shd w:fill="D9F0EA" w:val="clear"/>
+            <w:tcMar>
+              <w:top w:type="dxa" w:w="180"/>
+              <w:left w:type="dxa" w:w="220"/>
+              <w:bottom w:type="dxa" w:w="180"/>
+              <w:right w:type="dxa" w:w="220"/>
+            </w:tcMar>
+          </w:tcPr>
+          <w:p>
+            <w:pPr>
+              <w:spacing w:after="80" w:before="0" w:line="300"/>
+            </w:pPr>
+            <w:r>
+              <w:rPr>
+                <w:rFonts w:ascii="Arial" w:cs="Arial" w:eastAsia="Arial" w:hAnsi="Arial"/>
+                <w:b/>
+                <w:bCs/>
+                <w:color w:val="0F766E"/>
+                <w:sz w:val="22"/>
+                <w:szCs w:val="22"/>
+              </w:rPr>
+              <w:t xml:space="preserve">Implementation guidance</w:t>
+            </w:r>
+          </w:p>
+          <w:p>
+            <w:pPr>
+              <w:spacing w:after="0" w:before="0" w:line="300"/>
+            </w:pPr>
+            <w:r>
+              <w:rPr>
+                <w:rFonts w:ascii="Arial" w:cs="Arial" w:eastAsia="Arial" w:hAnsi="Arial"/>
+                <w:color w:val="111827"/>
+                <w:sz w:val="22"/>
+                <w:szCs w:val="22"/>
+              </w:rPr>
+              <w:t xml:space="preserve">Do not start with a giant platform. Start with a small, repeatable eval runner and durable transcript storage. Then add dashboards, scheduled reliability runs, safety red teaming, and production sampling as the program matures.</w:t>
+            </w:r>
+          </w:p>
+        </w:tc>
+      </w:tr>
+    </w:tbl>
     <w:p>
       <w:pPr>
         <w:pStyle w:val="Heading1"/>

</xml_diff>

<commit_message>
Updated eval guide documentations
</commit_message>
<xml_diff>
--- a/eval/AI_Agent_Evals_Team_Guide.docx
+++ b/eval/AI_Agent_Evals_Team_Guide.docx
@@ -37,6 +37,20 @@
     </w:p>
     <w:p>
       <w:pPr>
+        <w:pStyle w:val="Meta"/>
+      </w:pPr>
+      <w:r>
+        <w:rPr>
+          <w:rFonts w:ascii="Arial" w:hAnsi="Arial"/>
+          <w:b/>
+          <w:sz w:val="22"/>
+          <w:color w:val="1F4E79"/>
+        </w:rPr>
+        <w:t>Author: Fereydoun Babaei</w:t>
+      </w:r>
+    </w:p>
+    <w:p>
+      <w:pPr>
         <w:spacing w:after="520" w:before="0" w:line="300"/>
         <w:jc w:val="center"/>
       </w:pPr>
@@ -47,7 +61,7 @@
           <w:sz w:val="18"/>
           <w:szCs w:val="18"/>
         </w:rPr>
-        <w:t xml:space="preserve">Prepared for team discussion</w:t>
+        <w:t xml:space="preserve"/>
       </w:r>
     </w:p>
     <w:tbl>
@@ -4560,7 +4574,7 @@
           <w:sz w:val="22"/>
           <w:szCs w:val="22"/>
         </w:rPr>
-        <w:t xml:space="preserve">Step - Before any behavior-affecting change ships, run regression and safety suites.</w:t>
+        <w:t xml:space="preserve">11.1 Before any behavior-affecting change ships, run regression and safety suites.</w:t>
       </w:r>
     </w:p>
     <w:p>
@@ -4575,7 +4589,7 @@
           <w:sz w:val="22"/>
           <w:szCs w:val="22"/>
         </w:rPr>
-        <w:t xml:space="preserve">Step - Run repeat-trial reliability suites on a schedule because they cost more time and tokens.</w:t>
+        <w:t xml:space="preserve">11.2 Run repeat-trial reliability suites on a schedule because they cost more time and tokens.</w:t>
       </w:r>
     </w:p>
     <w:p>
@@ -4590,7 +4604,7 @@
           <w:sz w:val="22"/>
           <w:szCs w:val="22"/>
         </w:rPr>
-        <w:t xml:space="preserve">Step - If the model changes, rerun evals even if application code did not change.</w:t>
+        <w:t xml:space="preserve">11.3 If the model changes, rerun evals even if application code did not change.</w:t>
       </w:r>
     </w:p>
     <w:p>
@@ -4605,7 +4619,7 @@
           <w:sz w:val="22"/>
           <w:szCs w:val="22"/>
         </w:rPr>
-        <w:t xml:space="preserve">Step - Read transcripts regularly, especially when scores surprise the team.</w:t>
+        <w:t xml:space="preserve">11.4 Read transcripts regularly, especially when scores surprise the team.</w:t>
       </w:r>
     </w:p>
     <w:p>
@@ -4620,7 +4634,7 @@
           <w:sz w:val="22"/>
           <w:szCs w:val="22"/>
         </w:rPr>
-        <w:t xml:space="preserve">Step - Use transcript evidence to improve tools, not only prompts or models.</w:t>
+        <w:t xml:space="preserve">11.5 Use transcript evidence to improve tools, not only prompts or models.</w:t>
       </w:r>
     </w:p>
     <w:p>
@@ -4635,7 +4649,7 @@
           <w:sz w:val="22"/>
           <w:szCs w:val="22"/>
         </w:rPr>
-        <w:t xml:space="preserve">Step - Have engineers own the runner, graders, and storage; have domain experts author tasks in plain language.</w:t>
+        <w:t xml:space="preserve">11.6 Have engineers own the runner, graders, and storage; have domain experts author tasks in plain language.</w:t>
       </w:r>
     </w:p>
     <w:p>
@@ -4983,7 +4997,7 @@
           <w:sz w:val="22"/>
           <w:szCs w:val="22"/>
         </w:rPr>
-        <w:t xml:space="preserve">Step - Select one important agent workflow and write 20-50 realistic eval tasks from known failures, demos, and pre-release checks.</w:t>
+        <w:t xml:space="preserve">13.1 Select one important agent workflow and write 20-50 realistic eval tasks from known failures, demos, and pre-release checks.</w:t>
       </w:r>
     </w:p>
     <w:p>
@@ -4998,7 +5012,7 @@
           <w:sz w:val="22"/>
           <w:szCs w:val="22"/>
         </w:rPr>
-        <w:t xml:space="preserve">Step - Define success criteria, forbidden actions, and grading rules for each task.</w:t>
+        <w:t xml:space="preserve">13.2 Define success criteria, forbidden actions, and grading rules for each task.</w:t>
       </w:r>
     </w:p>
     <w:p>
@@ -5013,7 +5027,7 @@
           <w:sz w:val="22"/>
           <w:szCs w:val="22"/>
         </w:rPr>
-        <w:t xml:space="preserve">Step - Create a controlled test environment with resettable fixtures.</w:t>
+        <w:t xml:space="preserve">13.3 Create a controlled test environment with resettable fixtures.</w:t>
       </w:r>
     </w:p>
     <w:p>
@@ -5028,7 +5042,7 @@
           <w:sz w:val="22"/>
           <w:szCs w:val="22"/>
         </w:rPr>
-        <w:t xml:space="preserve">Step - Record complete transcripts for every run and store them durably.</w:t>
+        <w:t xml:space="preserve">13.4 Record complete transcripts for every run and store them durably.</w:t>
       </w:r>
     </w:p>
     <w:p>
@@ -5043,7 +5057,7 @@
           <w:sz w:val="22"/>
           <w:szCs w:val="22"/>
         </w:rPr>
-        <w:t xml:space="preserve">Step - Add code graders for objective outcomes and LLM judges for language and route quality.</w:t>
+        <w:t xml:space="preserve">13.5 Add code graders for objective outcomes and LLM judges for language and route quality.</w:t>
       </w:r>
     </w:p>
     <w:p>
@@ -5058,7 +5072,7 @@
           <w:sz w:val="22"/>
           <w:szCs w:val="22"/>
         </w:rPr>
-        <w:t xml:space="preserve">Step - Create a baseline scorecard and compare every behavior-affecting change against it.</w:t>
+        <w:t xml:space="preserve">13.6 Create a baseline scorecard and compare every behavior-affecting change against it.</w:t>
       </w:r>
     </w:p>
     <w:p>
@@ -5073,7 +5087,7 @@
           <w:sz w:val="22"/>
           <w:szCs w:val="22"/>
         </w:rPr>
-        <w:t xml:space="preserve">Step - Run safety checks every time and reliability checks on a scheduled cadence.</w:t>
+        <w:t xml:space="preserve">13.7 Run safety checks every time and reliability checks on a scheduled cadence.</w:t>
       </w:r>
     </w:p>
     <w:p>

</xml_diff>

<commit_message>
Focus AI eval guide PR scope
</commit_message>
<xml_diff>
--- a/eval/AI_Agent_Evals_Team_Guide.docx
+++ b/eval/AI_Agent_Evals_Team_Guide.docx
@@ -1,6 +1,6 @@
 
 <file path=word/document.xml><?xml version="1.0" encoding="utf-8"?>
-<w:document xmlns:wpc="http://schemas.microsoft.com/office/word/2010/wordprocessingCanvas" xmlns:mc="http://schemas.openxmlformats.org/markup-compatibility/2006" xmlns:o="urn:schemas-microsoft-com:office:office" xmlns:r="http://schemas.openxmlformats.org/officeDocument/2006/relationships" xmlns:m="http://schemas.openxmlformats.org/officeDocument/2006/math" xmlns:v="urn:schemas-microsoft-com:vml" xmlns:wp14="http://schemas.microsoft.com/office/word/2010/wordprocessingDrawing" xmlns:wp="http://schemas.openxmlformats.org/drawingml/2006/wordprocessingDrawing" xmlns:w10="urn:schemas-microsoft-com:office:word" xmlns:w="http://schemas.openxmlformats.org/wordprocessingml/2006/main" xmlns:w14="http://schemas.microsoft.com/office/word/2010/wordml" xmlns:w15="http://schemas.microsoft.com/office/word/2012/wordml" xmlns:wpg="http://schemas.microsoft.com/office/word/2010/wordprocessingGroup" xmlns:wpi="http://schemas.microsoft.com/office/word/2010/wordprocessingInk" xmlns:wne="http://schemas.microsoft.com/office/word/2006/wordml" xmlns:wps="http://schemas.microsoft.com/office/word/2010/wordprocessingShape" xmlns:cx="http://schemas.microsoft.com/office/drawing/2014/chartex" xmlns:cx1="http://schemas.microsoft.com/office/drawing/2015/9/8/chartex" xmlns:cx2="http://schemas.microsoft.com/office/drawing/2015/10/21/chartex" xmlns:cx3="http://schemas.microsoft.com/office/drawing/2016/5/9/chartex" xmlns:cx4="http://schemas.microsoft.com/office/drawing/2016/5/10/chartex" xmlns:cx5="http://schemas.microsoft.com/office/drawing/2016/5/11/chartex" xmlns:cx6="http://schemas.microsoft.com/office/drawing/2016/5/12/chartex" xmlns:cx7="http://schemas.microsoft.com/office/drawing/2016/5/13/chartex" xmlns:cx8="http://schemas.microsoft.com/office/drawing/2016/5/14/chartex" xmlns:aink="http://schemas.microsoft.com/office/drawing/2016/ink" xmlns:am3d="http://schemas.microsoft.com/office/drawing/2017/model3d" xmlns:w16cex="http://schemas.microsoft.com/office/word/2018/wordml/cex" xmlns:w16cid="http://schemas.microsoft.com/office/word/2016/wordml/cid" xmlns:w16="http://schemas.microsoft.com/office/word/2018/wordml" xmlns:w16sdtdh="http://schemas.microsoft.com/office/word/2020/wordml/sdtdatahash" xmlns:w16se="http://schemas.microsoft.com/office/word/2015/wordml/symex" mc:Ignorable="w14 w15 wp14">
+<w:document xmlns:ns1="http://schemas.openxmlformats.org/markup-compatibility/2006" xmlns:r="http://schemas.openxmlformats.org/officeDocument/2006/relationships" xmlns:w="http://schemas.openxmlformats.org/wordprocessingml/2006/main" ns1:Ignorable="w14 w15 wp14">
   <w:body>
     <w:p>
       <w:pPr>
@@ -3691,7 +3691,7 @@
     <w:p>
       <w:pPr>
         <w:spacing w:after="80" w:line="300"/>
-        <w:ind w:left="360"/>
+        <w:ind w:left="720" w:hanging="360"/>
       </w:pPr>
       <w:r>
         <w:rPr>
@@ -3706,7 +3706,7 @@
     <w:p>
       <w:pPr>
         <w:spacing w:after="80" w:line="300"/>
-        <w:ind w:left="360"/>
+        <w:ind w:left="720" w:hanging="360"/>
       </w:pPr>
       <w:r>
         <w:rPr>
@@ -3721,7 +3721,7 @@
     <w:p>
       <w:pPr>
         <w:spacing w:after="80" w:line="300"/>
-        <w:ind w:left="360"/>
+        <w:ind w:left="720" w:hanging="360"/>
       </w:pPr>
       <w:r>
         <w:rPr>
@@ -3736,7 +3736,7 @@
     <w:p>
       <w:pPr>
         <w:spacing w:after="80" w:line="300"/>
-        <w:ind w:left="360"/>
+        <w:ind w:left="720" w:hanging="360"/>
       </w:pPr>
       <w:r>
         <w:rPr>
@@ -3751,7 +3751,7 @@
     <w:p>
       <w:pPr>
         <w:spacing w:after="80" w:line="300"/>
-        <w:ind w:left="360"/>
+        <w:ind w:left="720" w:hanging="360"/>
       </w:pPr>
       <w:r>
         <w:rPr>
@@ -3766,7 +3766,7 @@
     <w:p>
       <w:pPr>
         <w:spacing w:after="80" w:line="300"/>
-        <w:ind w:left="360"/>
+        <w:ind w:left="720" w:hanging="360"/>
       </w:pPr>
       <w:r>
         <w:rPr>
@@ -3781,7 +3781,7 @@
     <w:p>
       <w:pPr>
         <w:spacing w:after="80" w:line="300"/>
-        <w:ind w:left="360"/>
+        <w:ind w:left="720" w:hanging="360"/>
       </w:pPr>
       <w:r>
         <w:rPr>
@@ -4565,7 +4565,7 @@
     <w:p>
       <w:pPr>
         <w:spacing w:after="80" w:line="300"/>
-        <w:ind w:left="360"/>
+        <w:ind w:left="720" w:hanging="360"/>
       </w:pPr>
       <w:r>
         <w:rPr>
@@ -4574,13 +4574,13 @@
           <w:sz w:val="22"/>
           <w:szCs w:val="22"/>
         </w:rPr>
-        <w:t xml:space="preserve">11.1 Before any behavior-affecting change ships, run regression and safety suites.</w:t>
+        <w:t xml:space="preserve">- Before any behavior-affecting change ships, run regression and safety suites.</w:t>
       </w:r>
     </w:p>
     <w:p>
       <w:pPr>
         <w:spacing w:after="80" w:line="300"/>
-        <w:ind w:left="360"/>
+        <w:ind w:left="720" w:hanging="360"/>
       </w:pPr>
       <w:r>
         <w:rPr>
@@ -4589,13 +4589,13 @@
           <w:sz w:val="22"/>
           <w:szCs w:val="22"/>
         </w:rPr>
-        <w:t xml:space="preserve">11.2 Run repeat-trial reliability suites on a schedule because they cost more time and tokens.</w:t>
+        <w:t xml:space="preserve">- Run repeat-trial reliability suites on a schedule because they cost more time and tokens.</w:t>
       </w:r>
     </w:p>
     <w:p>
       <w:pPr>
         <w:spacing w:after="80" w:line="300"/>
-        <w:ind w:left="360"/>
+        <w:ind w:left="720" w:hanging="360"/>
       </w:pPr>
       <w:r>
         <w:rPr>
@@ -4604,13 +4604,13 @@
           <w:sz w:val="22"/>
           <w:szCs w:val="22"/>
         </w:rPr>
-        <w:t xml:space="preserve">11.3 If the model changes, rerun evals even if application code did not change.</w:t>
+        <w:t xml:space="preserve">- If the model changes, rerun evals even if application code did not change.</w:t>
       </w:r>
     </w:p>
     <w:p>
       <w:pPr>
         <w:spacing w:after="80" w:line="300"/>
-        <w:ind w:left="360"/>
+        <w:ind w:left="720" w:hanging="360"/>
       </w:pPr>
       <w:r>
         <w:rPr>
@@ -4619,13 +4619,13 @@
           <w:sz w:val="22"/>
           <w:szCs w:val="22"/>
         </w:rPr>
-        <w:t xml:space="preserve">11.4 Read transcripts regularly, especially when scores surprise the team.</w:t>
+        <w:t xml:space="preserve">- Read transcripts regularly, especially when scores surprise the team.</w:t>
       </w:r>
     </w:p>
     <w:p>
       <w:pPr>
         <w:spacing w:after="80" w:line="300"/>
-        <w:ind w:left="360"/>
+        <w:ind w:left="720" w:hanging="360"/>
       </w:pPr>
       <w:r>
         <w:rPr>
@@ -4634,13 +4634,13 @@
           <w:sz w:val="22"/>
           <w:szCs w:val="22"/>
         </w:rPr>
-        <w:t xml:space="preserve">11.5 Use transcript evidence to improve tools, not only prompts or models.</w:t>
+        <w:t xml:space="preserve">- Use transcript evidence to improve tools, not only prompts or models.</w:t>
       </w:r>
     </w:p>
     <w:p>
       <w:pPr>
         <w:spacing w:after="80" w:line="300"/>
-        <w:ind w:left="360"/>
+        <w:ind w:left="720" w:hanging="360"/>
       </w:pPr>
       <w:r>
         <w:rPr>
@@ -4649,7 +4649,7 @@
           <w:sz w:val="22"/>
           <w:szCs w:val="22"/>
         </w:rPr>
-        <w:t xml:space="preserve">11.6 Have engineers own the runner, graders, and storage; have domain experts author tasks in plain language.</w:t>
+        <w:t xml:space="preserve">- Have engineers own the runner, graders, and storage; have domain experts author tasks in plain language.</w:t>
       </w:r>
     </w:p>
     <w:p>
@@ -4988,7 +4988,7 @@
     <w:p>
       <w:pPr>
         <w:spacing w:after="80" w:line="300"/>
-        <w:ind w:left="360"/>
+        <w:ind w:left="720" w:hanging="360"/>
       </w:pPr>
       <w:r>
         <w:rPr>
@@ -4997,13 +4997,13 @@
           <w:sz w:val="22"/>
           <w:szCs w:val="22"/>
         </w:rPr>
-        <w:t xml:space="preserve">13.1 Select one important agent workflow and write 20-50 realistic eval tasks from known failures, demos, and pre-release checks.</w:t>
+        <w:t xml:space="preserve">- Select one important agent workflow and write 20-50 realistic eval tasks from known failures, demos, and pre-release checks.</w:t>
       </w:r>
     </w:p>
     <w:p>
       <w:pPr>
         <w:spacing w:after="80" w:line="300"/>
-        <w:ind w:left="360"/>
+        <w:ind w:left="720" w:hanging="360"/>
       </w:pPr>
       <w:r>
         <w:rPr>
@@ -5012,13 +5012,13 @@
           <w:sz w:val="22"/>
           <w:szCs w:val="22"/>
         </w:rPr>
-        <w:t xml:space="preserve">13.2 Define success criteria, forbidden actions, and grading rules for each task.</w:t>
+        <w:t xml:space="preserve">- Define success criteria, forbidden actions, and grading rules for each task.</w:t>
       </w:r>
     </w:p>
     <w:p>
       <w:pPr>
         <w:spacing w:after="80" w:line="300"/>
-        <w:ind w:left="360"/>
+        <w:ind w:left="720" w:hanging="360"/>
       </w:pPr>
       <w:r>
         <w:rPr>
@@ -5027,13 +5027,13 @@
           <w:sz w:val="22"/>
           <w:szCs w:val="22"/>
         </w:rPr>
-        <w:t xml:space="preserve">13.3 Create a controlled test environment with resettable fixtures.</w:t>
+        <w:t xml:space="preserve">- Create a controlled test environment with resettable fixtures.</w:t>
       </w:r>
     </w:p>
     <w:p>
       <w:pPr>
         <w:spacing w:after="80" w:line="300"/>
-        <w:ind w:left="360"/>
+        <w:ind w:left="720" w:hanging="360"/>
       </w:pPr>
       <w:r>
         <w:rPr>
@@ -5042,13 +5042,13 @@
           <w:sz w:val="22"/>
           <w:szCs w:val="22"/>
         </w:rPr>
-        <w:t xml:space="preserve">13.4 Record complete transcripts for every run and store them durably.</w:t>
+        <w:t xml:space="preserve">- Record complete transcripts for every run and store them durably.</w:t>
       </w:r>
     </w:p>
     <w:p>
       <w:pPr>
         <w:spacing w:after="80" w:line="300"/>
-        <w:ind w:left="360"/>
+        <w:ind w:left="720" w:hanging="360"/>
       </w:pPr>
       <w:r>
         <w:rPr>
@@ -5057,13 +5057,13 @@
           <w:sz w:val="22"/>
           <w:szCs w:val="22"/>
         </w:rPr>
-        <w:t xml:space="preserve">13.5 Add code graders for objective outcomes and LLM judges for language and route quality.</w:t>
+        <w:t xml:space="preserve">- Add code graders for objective outcomes and LLM judges for language and route quality.</w:t>
       </w:r>
     </w:p>
     <w:p>
       <w:pPr>
         <w:spacing w:after="80" w:line="300"/>
-        <w:ind w:left="360"/>
+        <w:ind w:left="720" w:hanging="360"/>
       </w:pPr>
       <w:r>
         <w:rPr>
@@ -5072,13 +5072,13 @@
           <w:sz w:val="22"/>
           <w:szCs w:val="22"/>
         </w:rPr>
-        <w:t xml:space="preserve">13.6 Create a baseline scorecard and compare every behavior-affecting change against it.</w:t>
+        <w:t xml:space="preserve">- Create a baseline scorecard and compare every behavior-affecting change against it.</w:t>
       </w:r>
     </w:p>
     <w:p>
       <w:pPr>
         <w:spacing w:after="80" w:line="300"/>
-        <w:ind w:left="360"/>
+        <w:ind w:left="720" w:hanging="360"/>
       </w:pPr>
       <w:r>
         <w:rPr>
@@ -5087,7 +5087,7 @@
           <w:sz w:val="22"/>
           <w:szCs w:val="22"/>
         </w:rPr>
-        <w:t xml:space="preserve">13.7 Run safety checks every time and reliability checks on a scheduled cadence.</w:t>
+        <w:t xml:space="preserve">- Run safety checks every time and reliability checks on a scheduled cadence.</w:t>
       </w:r>
     </w:p>
     <w:p>
@@ -6326,7 +6326,7 @@
     <w:p>
       <w:pPr>
         <w:spacing w:after="80" w:line="300"/>
-        <w:ind w:left="360"/>
+        <w:ind w:left="720" w:hanging="360"/>
       </w:pPr>
       <w:r>
         <w:rPr>
@@ -6341,7 +6341,7 @@
     <w:p>
       <w:pPr>
         <w:spacing w:after="80" w:line="300"/>
-        <w:ind w:left="360"/>
+        <w:ind w:left="720" w:hanging="360"/>
       </w:pPr>
       <w:r>
         <w:rPr>
@@ -6356,7 +6356,7 @@
     <w:p>
       <w:pPr>
         <w:spacing w:after="80" w:line="300"/>
-        <w:ind w:left="360"/>
+        <w:ind w:left="720" w:hanging="360"/>
       </w:pPr>
       <w:r>
         <w:rPr>
@@ -6371,7 +6371,7 @@
     <w:p>
       <w:pPr>
         <w:spacing w:after="80" w:line="300"/>
-        <w:ind w:left="360"/>
+        <w:ind w:left="720" w:hanging="360"/>
       </w:pPr>
       <w:r>
         <w:rPr>
@@ -6386,7 +6386,7 @@
     <w:p>
       <w:pPr>
         <w:spacing w:after="80" w:line="300"/>
-        <w:ind w:left="360"/>
+        <w:ind w:left="720" w:hanging="360"/>
       </w:pPr>
       <w:r>
         <w:rPr>
@@ -6401,7 +6401,7 @@
     <w:p>
       <w:pPr>
         <w:spacing w:after="80" w:line="300"/>
-        <w:ind w:left="360"/>
+        <w:ind w:left="720" w:hanging="360"/>
       </w:pPr>
       <w:r>
         <w:rPr>
@@ -6416,7 +6416,7 @@
     <w:p>
       <w:pPr>
         <w:spacing w:after="80" w:line="300"/>
-        <w:ind w:left="360"/>
+        <w:ind w:left="720" w:hanging="360"/>
       </w:pPr>
       <w:r>
         <w:rPr>
@@ -6532,7 +6532,7 @@
     <w:p>
       <w:pPr>
         <w:spacing w:after="80" w:line="300"/>
-        <w:ind w:left="360"/>
+        <w:ind w:left="720" w:hanging="360"/>
       </w:pPr>
       <w:r>
         <w:rPr>
@@ -6547,7 +6547,7 @@
     <w:p>
       <w:pPr>
         <w:spacing w:after="80" w:line="300"/>
-        <w:ind w:left="360"/>
+        <w:ind w:left="720" w:hanging="360"/>
       </w:pPr>
       <w:r>
         <w:rPr>
@@ -6562,7 +6562,7 @@
     <w:p>
       <w:pPr>
         <w:spacing w:after="80" w:line="300"/>
-        <w:ind w:left="360"/>
+        <w:ind w:left="720" w:hanging="360"/>
       </w:pPr>
       <w:r>
         <w:rPr>
@@ -6577,7 +6577,7 @@
     <w:p>
       <w:pPr>
         <w:spacing w:after="80" w:line="300"/>
-        <w:ind w:left="360"/>
+        <w:ind w:left="720" w:hanging="360"/>
       </w:pPr>
       <w:r>
         <w:rPr>
@@ -6592,7 +6592,7 @@
     <w:p>
       <w:pPr>
         <w:spacing w:after="80" w:line="300"/>
-        <w:ind w:left="360"/>
+        <w:ind w:left="720" w:hanging="360"/>
       </w:pPr>
       <w:r>
         <w:rPr>
@@ -6607,7 +6607,7 @@
     <w:p>
       <w:pPr>
         <w:spacing w:after="80" w:line="300"/>
-        <w:ind w:left="360"/>
+        <w:ind w:left="720" w:hanging="360"/>
       </w:pPr>
       <w:r>
         <w:rPr>

</xml_diff>